<commit_message>
Informe y tablas con una sola maquina
Se retira la Maquina 2 del Word y del Excel; quedan solo las
mediciones de la Maquina 1.
</commit_message>
<xml_diff>
--- a/Docs/Observaciones-Lab6.docx
+++ b/Docs/Observaciones-Lab6.docx
@@ -111,8 +111,7 @@
       </w:tblPr>
       <w:tblGrid>
         <w:gridCol w:w="2425"/>
-        <w:gridCol w:w="2898"/>
-        <w:gridCol w:w="2899"/>
+        <w:gridCol w:w="5797"/>
       </w:tblGrid>
       <w:tr>
         <w:trPr>
@@ -140,7 +139,7 @@
         </w:tc>
         <w:tc>
           <w:tcPr>
-            <w:tcW w:w="1763" w:type="pct"/>
+            <w:tcW w:w="3525" w:type="pct"/>
             <w:tcBorders>
               <w:top w:val="single" w:sz="4" w:space="0" w:color="auto"/>
             </w:tcBorders>
@@ -160,31 +159,6 @@
                 <w:lang w:val="es-419"/>
               </w:rPr>
               <w:t>Máquina 1</w:t>
-            </w:r>
-          </w:p>
-        </w:tc>
-        <w:tc>
-          <w:tcPr>
-            <w:tcW w:w="1763" w:type="pct"/>
-            <w:tcBorders>
-              <w:top w:val="single" w:sz="4" w:space="0" w:color="auto"/>
-            </w:tcBorders>
-          </w:tcPr>
-          <w:p>
-            <w:pPr>
-              <w:jc w:val="center"/>
-              <w:cnfStyle w:val="100000000000" w:firstRow="1" w:lastRow="0" w:firstColumn="0" w:lastColumn="0" w:oddVBand="0" w:evenVBand="0" w:oddHBand="0" w:evenHBand="0" w:firstRowFirstColumn="0" w:firstRowLastColumn="0" w:lastRowFirstColumn="0" w:lastRowLastColumn="0"/>
-              <w:rPr>
-                <w:rFonts w:ascii="Dax-Regular" w:hAnsi="Dax-Regular"/>
-                <w:lang w:val="es-419"/>
-              </w:rPr>
-            </w:pPr>
-            <w:r>
-              <w:rPr>
-                <w:rFonts w:ascii="Dax-Regular" w:hAnsi="Dax-Regular"/>
-                <w:lang w:val="es-419"/>
-              </w:rPr>
-              <w:t>Máquina 2</w:t>
             </w:r>
           </w:p>
         </w:tc>
@@ -218,7 +192,7 @@
         </w:tc>
         <w:tc>
           <w:tcPr>
-            <w:tcW w:w="1763" w:type="pct"/>
+            <w:tcW w:w="3525" w:type="pct"/>
           </w:tcPr>
           <w:p>
             <w:pPr>
@@ -235,28 +209,6 @@
                 <w:lang w:val="es-419"/>
               </w:rPr>
               <w:t>12th Gen Intel(R) Core(TM) i5-1235U</w:t>
-            </w:r>
-          </w:p>
-        </w:tc>
-        <w:tc>
-          <w:tcPr>
-            <w:tcW w:w="1763" w:type="pct"/>
-          </w:tcPr>
-          <w:p>
-            <w:pPr>
-              <w:jc w:val="both"/>
-              <w:cnfStyle w:val="000000100000" w:firstRow="0" w:lastRow="0" w:firstColumn="0" w:lastColumn="0" w:oddVBand="0" w:evenVBand="0" w:oddHBand="1" w:evenHBand="0" w:firstRowFirstColumn="0" w:firstRowLastColumn="0" w:lastRowFirstColumn="0" w:lastRowLastColumn="0"/>
-              <w:rPr>
-                <w:rFonts w:ascii="Dax-Regular" w:hAnsi="Dax-Regular"/>
-                <w:lang w:val="es-419"/>
-              </w:rPr>
-            </w:pPr>
-            <w:r>
-              <w:rPr>
-                <w:rFonts w:ascii="Dax-Regular" w:hAnsi="Dax-Regular"/>
-                <w:lang w:val="es-419"/>
-              </w:rPr>
-              <w:t>12th Gen Intel(R) Core(TM) i5-12500H</w:t>
             </w:r>
           </w:p>
         </w:tc>
@@ -289,7 +241,7 @@
         </w:tc>
         <w:tc>
           <w:tcPr>
-            <w:tcW w:w="1763" w:type="pct"/>
+            <w:tcW w:w="3525" w:type="pct"/>
           </w:tcPr>
           <w:p>
             <w:pPr>
@@ -306,28 +258,6 @@
                 <w:lang w:val="es-419"/>
               </w:rPr>
               <w:t>12 GB</w:t>
-            </w:r>
-          </w:p>
-        </w:tc>
-        <w:tc>
-          <w:tcPr>
-            <w:tcW w:w="1763" w:type="pct"/>
-          </w:tcPr>
-          <w:p>
-            <w:pPr>
-              <w:jc w:val="both"/>
-              <w:cnfStyle w:val="000000000000" w:firstRow="0" w:lastRow="0" w:firstColumn="0" w:lastColumn="0" w:oddVBand="0" w:evenVBand="0" w:oddHBand="0" w:evenHBand="0" w:firstRowFirstColumn="0" w:firstRowLastColumn="0" w:lastRowFirstColumn="0" w:lastRowLastColumn="0"/>
-              <w:rPr>
-                <w:rFonts w:ascii="Dax-Regular" w:hAnsi="Dax-Regular"/>
-                <w:lang w:val="es-419"/>
-              </w:rPr>
-            </w:pPr>
-            <w:r>
-              <w:rPr>
-                <w:rFonts w:ascii="Dax-Regular" w:hAnsi="Dax-Regular"/>
-                <w:lang w:val="es-419"/>
-              </w:rPr>
-              <w:t>16 GB</w:t>
             </w:r>
           </w:p>
         </w:tc>
@@ -361,29 +291,7 @@
         </w:tc>
         <w:tc>
           <w:tcPr>
-            <w:tcW w:w="1763" w:type="pct"/>
-          </w:tcPr>
-          <w:p>
-            <w:pPr>
-              <w:jc w:val="both"/>
-              <w:cnfStyle w:val="000000100000" w:firstRow="0" w:lastRow="0" w:firstColumn="0" w:lastColumn="0" w:oddVBand="0" w:evenVBand="0" w:oddHBand="1" w:evenHBand="0" w:firstRowFirstColumn="0" w:firstRowLastColumn="0" w:lastRowFirstColumn="0" w:lastRowLastColumn="0"/>
-              <w:rPr>
-                <w:rFonts w:ascii="Dax-Regular" w:hAnsi="Dax-Regular"/>
-                <w:lang w:val="es-419"/>
-              </w:rPr>
-            </w:pPr>
-            <w:r>
-              <w:rPr>
-                <w:rFonts w:ascii="Dax-Regular" w:hAnsi="Dax-Regular"/>
-                <w:lang w:val="es-419"/>
-              </w:rPr>
-              <w:t>Windows 11 Home Single Language 64 bits</w:t>
-            </w:r>
-          </w:p>
-        </w:tc>
-        <w:tc>
-          <w:tcPr>
-            <w:tcW w:w="1763" w:type="pct"/>
+            <w:tcW w:w="3525" w:type="pct"/>
           </w:tcPr>
           <w:p>
             <w:pPr>
@@ -1857,1324 +1765,6 @@
         <w:t xml:space="preserve">CHAINING </w:t>
       </w:r>
     </w:p>
-    <w:tbl>
-      <w:tblPr>
-        <w:tblW w:w="5000" w:type="pct"/>
-        <w:tblLook w:val="04A0" w:firstRow="1" w:lastRow="0" w:firstColumn="1" w:lastColumn="0" w:noHBand="0" w:noVBand="1"/>
-      </w:tblPr>
-      <w:tblGrid>
-        <w:gridCol w:w="3324"/>
-        <w:gridCol w:w="3134"/>
-        <w:gridCol w:w="2902"/>
-      </w:tblGrid>
-      <w:tr>
-        <w:trPr>
-          <w:trHeight w:val="360"/>
-        </w:trPr>
-        <w:tc>
-          <w:tcPr>
-            <w:tcW w:w="5000" w:type="pct"/>
-            <w:gridSpan w:val="3"/>
-            <w:tcBorders>
-              <w:top w:val="nil"/>
-              <w:left w:val="nil"/>
-              <w:bottom w:val="nil"/>
-              <w:right w:val="nil"/>
-            </w:tcBorders>
-            <w:noWrap/>
-            <w:vAlign w:val="center"/>
-            <w:hideMark/>
-          </w:tcPr>
-          <w:p>
-            <w:pPr>
-              <w:spacing w:after="0" w:line="240" w:lineRule="auto"/>
-              <w:jc w:val="center"/>
-              <w:rPr>
-                <w:rFonts w:ascii="Calibri" w:eastAsia="Times New Roman" w:hAnsi="Calibri" w:cs="Calibri"/>
-                <w:b/>
-                <w:bCs/>
-                <w:i/>
-                <w:iCs/>
-                <w:color w:val="000000"/>
-                <w:sz w:val="28"/>
-                <w:szCs w:val="28"/>
-                <w:u w:val="single"/>
-                <w:lang w:val="es-419"/>
-              </w:rPr>
-            </w:pPr>
-            <w:r>
-              <w:rPr>
-                <w:rFonts w:ascii="Calibri" w:eastAsia="Times New Roman" w:hAnsi="Calibri" w:cs="Calibri"/>
-                <w:b/>
-                <w:bCs/>
-                <w:i/>
-                <w:iCs/>
-                <w:color w:val="000000"/>
-                <w:sz w:val="28"/>
-                <w:szCs w:val="28"/>
-                <w:u w:val="single"/>
-                <w:lang w:val="es-419"/>
-              </w:rPr>
-              <w:t>Carga de Catálogo LINEAR PROBING – MÁQUINA 2</w:t>
-            </w:r>
-          </w:p>
-        </w:tc>
-      </w:tr>
-      <w:tr>
-        <w:trPr>
-          <w:trHeight w:val="107"/>
-        </w:trPr>
-        <w:tc>
-          <w:tcPr>
-            <w:tcW w:w="1776" w:type="pct"/>
-            <w:tcBorders>
-              <w:top w:val="single" w:sz="4" w:space="0" w:color="000000"/>
-              <w:left w:val="nil"/>
-              <w:bottom w:val="single" w:sz="4" w:space="0" w:color="000000"/>
-              <w:right w:val="nil"/>
-            </w:tcBorders>
-            <w:vAlign w:val="center"/>
-            <w:hideMark/>
-          </w:tcPr>
-          <w:p>
-            <w:pPr>
-              <w:spacing w:after="0" w:line="240" w:lineRule="auto"/>
-              <w:jc w:val="center"/>
-              <w:rPr>
-                <w:rFonts w:ascii="Calibri" w:eastAsia="Times New Roman" w:hAnsi="Calibri" w:cs="Calibri"/>
-                <w:b/>
-                <w:bCs/>
-                <w:color w:val="000000"/>
-                <w:lang w:val="es-419"/>
-              </w:rPr>
-            </w:pPr>
-            <w:r>
-              <w:rPr>
-                <w:rFonts w:ascii="Calibri" w:eastAsia="Times New Roman" w:hAnsi="Calibri" w:cs="Calibri"/>
-                <w:b/>
-                <w:bCs/>
-                <w:color w:val="000000"/>
-                <w:lang w:val="es-419"/>
-              </w:rPr>
-              <w:t>Factor de Carga (PROBING)</w:t>
-            </w:r>
-          </w:p>
-        </w:tc>
-        <w:tc>
-          <w:tcPr>
-            <w:tcW w:w="1674" w:type="pct"/>
-            <w:tcBorders>
-              <w:top w:val="single" w:sz="4" w:space="0" w:color="000000"/>
-              <w:left w:val="nil"/>
-              <w:bottom w:val="single" w:sz="4" w:space="0" w:color="000000"/>
-              <w:right w:val="nil"/>
-            </w:tcBorders>
-            <w:vAlign w:val="center"/>
-            <w:hideMark/>
-          </w:tcPr>
-          <w:p>
-            <w:pPr>
-              <w:spacing w:after="0" w:line="240" w:lineRule="auto"/>
-              <w:jc w:val="center"/>
-              <w:rPr>
-                <w:rFonts w:ascii="Calibri" w:eastAsia="Times New Roman" w:hAnsi="Calibri" w:cs="Calibri"/>
-                <w:b/>
-                <w:bCs/>
-                <w:color w:val="000000"/>
-                <w:lang w:val="es-419"/>
-              </w:rPr>
-            </w:pPr>
-            <w:r>
-              <w:rPr>
-                <w:rFonts w:ascii="Calibri" w:eastAsia="Times New Roman" w:hAnsi="Calibri" w:cs="Calibri"/>
-                <w:b/>
-                <w:bCs/>
-                <w:color w:val="000000"/>
-                <w:lang w:val="es-419"/>
-              </w:rPr>
-              <w:t>Consumo de Datos [kB]</w:t>
-            </w:r>
-          </w:p>
-        </w:tc>
-        <w:tc>
-          <w:tcPr>
-            <w:tcW w:w="1550" w:type="pct"/>
-            <w:tcBorders>
-              <w:top w:val="single" w:sz="4" w:space="0" w:color="000000"/>
-              <w:left w:val="nil"/>
-              <w:bottom w:val="single" w:sz="4" w:space="0" w:color="000000"/>
-              <w:right w:val="nil"/>
-            </w:tcBorders>
-            <w:vAlign w:val="center"/>
-            <w:hideMark/>
-          </w:tcPr>
-          <w:p>
-            <w:pPr>
-              <w:spacing w:after="0" w:line="240" w:lineRule="auto"/>
-              <w:jc w:val="center"/>
-              <w:rPr>
-                <w:rFonts w:ascii="Calibri" w:eastAsia="Times New Roman" w:hAnsi="Calibri" w:cs="Calibri"/>
-                <w:b/>
-                <w:bCs/>
-                <w:color w:val="000000"/>
-                <w:lang w:val="es-419"/>
-              </w:rPr>
-            </w:pPr>
-            <w:r>
-              <w:rPr>
-                <w:rFonts w:ascii="Calibri" w:eastAsia="Times New Roman" w:hAnsi="Calibri" w:cs="Calibri"/>
-                <w:b/>
-                <w:bCs/>
-                <w:color w:val="000000"/>
-                <w:lang w:val="es-419"/>
-              </w:rPr>
-              <w:t>Tiempo de Ejecución Real @LP [ms]</w:t>
-            </w:r>
-          </w:p>
-        </w:tc>
-      </w:tr>
-      <w:tr>
-        <w:trPr>
-          <w:trHeight w:val="40"/>
-        </w:trPr>
-        <w:tc>
-          <w:tcPr>
-            <w:tcW w:w="1776" w:type="pct"/>
-            <w:tcBorders>
-              <w:top w:val="nil"/>
-              <w:left w:val="nil"/>
-              <w:bottom w:val="nil"/>
-              <w:right w:val="nil"/>
-            </w:tcBorders>
-            <w:shd w:val="clear" w:color="000000" w:fill="D9D9D9"/>
-            <w:vAlign w:val="center"/>
-            <w:hideMark/>
-          </w:tcPr>
-          <w:p>
-            <w:pPr>
-              <w:spacing w:after="0" w:line="240" w:lineRule="auto"/>
-              <w:jc w:val="center"/>
-              <w:rPr>
-                <w:rFonts w:ascii="Calibri" w:eastAsia="Times New Roman" w:hAnsi="Calibri" w:cs="Calibri"/>
-                <w:color w:val="000000"/>
-                <w:lang w:val="es-419"/>
-              </w:rPr>
-            </w:pPr>
-            <w:r>
-              <w:rPr>
-                <w:rFonts w:ascii="Calibri" w:eastAsia="Times New Roman" w:hAnsi="Calibri" w:cs="Calibri"/>
-                <w:color w:val="000000"/>
-                <w:lang w:val="es-419"/>
-              </w:rPr>
-              <w:t>0.1</w:t>
-            </w:r>
-          </w:p>
-        </w:tc>
-        <w:tc>
-          <w:tcPr>
-            <w:tcW w:w="1674" w:type="pct"/>
-            <w:tcBorders>
-              <w:top w:val="nil"/>
-              <w:left w:val="nil"/>
-              <w:bottom w:val="nil"/>
-              <w:right w:val="nil"/>
-            </w:tcBorders>
-            <w:shd w:val="clear" w:color="D9D9D9" w:fill="D9D9D9"/>
-            <w:vAlign w:val="center"/>
-          </w:tcPr>
-          <w:p>
-            <w:pPr>
-              <w:spacing w:after="0" w:line="240" w:lineRule="auto"/>
-              <w:jc w:val="center"/>
-              <w:rPr>
-                <w:rFonts w:ascii="Calibri" w:eastAsia="Times New Roman" w:hAnsi="Calibri" w:cs="Calibri"/>
-                <w:color w:val="000000"/>
-                <w:lang w:val="es-419"/>
-              </w:rPr>
-            </w:pPr>
-            <w:r>
-              <w:rPr>
-                <w:rFonts w:ascii="Calibri" w:eastAsia="Times New Roman" w:hAnsi="Calibri" w:cs="Calibri"/>
-                <w:color w:val="000000"/>
-                <w:lang w:val="es-419"/>
-              </w:rPr>
-              <w:t>467 473.29</w:t>
-            </w:r>
-          </w:p>
-        </w:tc>
-        <w:tc>
-          <w:tcPr>
-            <w:tcW w:w="1550" w:type="pct"/>
-            <w:tcBorders>
-              <w:top w:val="nil"/>
-              <w:left w:val="nil"/>
-              <w:bottom w:val="nil"/>
-              <w:right w:val="nil"/>
-            </w:tcBorders>
-            <w:shd w:val="clear" w:color="D9D9D9" w:fill="D9D9D9"/>
-            <w:noWrap/>
-            <w:vAlign w:val="center"/>
-          </w:tcPr>
-          <w:p>
-            <w:pPr>
-              <w:spacing w:after="0" w:line="240" w:lineRule="auto"/>
-              <w:jc w:val="center"/>
-              <w:rPr>
-                <w:rFonts w:ascii="Calibri" w:eastAsia="Times New Roman" w:hAnsi="Calibri" w:cs="Calibri"/>
-                <w:color w:val="000000"/>
-                <w:lang w:val="es-419"/>
-              </w:rPr>
-            </w:pPr>
-            <w:r>
-              <w:rPr>
-                <w:rFonts w:ascii="Calibri" w:eastAsia="Times New Roman" w:hAnsi="Calibri" w:cs="Calibri"/>
-                <w:color w:val="000000"/>
-                <w:lang w:val="es-419"/>
-              </w:rPr>
-              <w:t>5 852.00</w:t>
-            </w:r>
-          </w:p>
-        </w:tc>
-      </w:tr>
-      <w:tr>
-        <w:trPr>
-          <w:trHeight w:val="50"/>
-        </w:trPr>
-        <w:tc>
-          <w:tcPr>
-            <w:tcW w:w="1776" w:type="pct"/>
-            <w:tcBorders>
-              <w:top w:val="nil"/>
-              <w:left w:val="nil"/>
-              <w:bottom w:val="nil"/>
-              <w:right w:val="nil"/>
-            </w:tcBorders>
-            <w:vAlign w:val="center"/>
-            <w:hideMark/>
-          </w:tcPr>
-          <w:p>
-            <w:pPr>
-              <w:spacing w:after="0" w:line="240" w:lineRule="auto"/>
-              <w:jc w:val="center"/>
-              <w:rPr>
-                <w:rFonts w:ascii="Calibri" w:eastAsia="Times New Roman" w:hAnsi="Calibri" w:cs="Calibri"/>
-                <w:color w:val="000000"/>
-                <w:lang w:val="es-419"/>
-              </w:rPr>
-            </w:pPr>
-            <w:r>
-              <w:rPr>
-                <w:rFonts w:ascii="Calibri" w:eastAsia="Times New Roman" w:hAnsi="Calibri" w:cs="Calibri"/>
-                <w:color w:val="000000"/>
-                <w:lang w:val="es-419"/>
-              </w:rPr>
-              <w:t>0.5</w:t>
-            </w:r>
-          </w:p>
-        </w:tc>
-        <w:tc>
-          <w:tcPr>
-            <w:tcW w:w="1674" w:type="pct"/>
-            <w:tcBorders>
-              <w:top w:val="nil"/>
-              <w:left w:val="nil"/>
-              <w:bottom w:val="nil"/>
-              <w:right w:val="nil"/>
-            </w:tcBorders>
-            <w:vAlign w:val="center"/>
-          </w:tcPr>
-          <w:p>
-            <w:pPr>
-              <w:spacing w:after="0" w:line="240" w:lineRule="auto"/>
-              <w:jc w:val="center"/>
-              <w:rPr>
-                <w:rFonts w:ascii="Calibri" w:eastAsia="Times New Roman" w:hAnsi="Calibri" w:cs="Calibri"/>
-                <w:color w:val="000000"/>
-                <w:lang w:val="es-419"/>
-              </w:rPr>
-            </w:pPr>
-            <w:r>
-              <w:rPr>
-                <w:rFonts w:ascii="Calibri" w:eastAsia="Times New Roman" w:hAnsi="Calibri" w:cs="Calibri"/>
-                <w:color w:val="000000"/>
-                <w:lang w:val="es-419"/>
-              </w:rPr>
-              <w:t>379 217.02</w:t>
-            </w:r>
-          </w:p>
-        </w:tc>
-        <w:tc>
-          <w:tcPr>
-            <w:tcW w:w="1550" w:type="pct"/>
-            <w:tcBorders>
-              <w:top w:val="nil"/>
-              <w:left w:val="nil"/>
-              <w:bottom w:val="nil"/>
-              <w:right w:val="nil"/>
-            </w:tcBorders>
-            <w:noWrap/>
-            <w:vAlign w:val="center"/>
-          </w:tcPr>
-          <w:p>
-            <w:pPr>
-              <w:spacing w:after="0" w:line="240" w:lineRule="auto"/>
-              <w:jc w:val="center"/>
-              <w:rPr>
-                <w:rFonts w:ascii="Calibri" w:eastAsia="Times New Roman" w:hAnsi="Calibri" w:cs="Calibri"/>
-                <w:color w:val="000000"/>
-                <w:lang w:val="es-419"/>
-              </w:rPr>
-            </w:pPr>
-            <w:r>
-              <w:rPr>
-                <w:rFonts w:ascii="Calibri" w:eastAsia="Times New Roman" w:hAnsi="Calibri" w:cs="Calibri"/>
-                <w:color w:val="000000"/>
-                <w:lang w:val="es-419"/>
-              </w:rPr>
-              <w:t>5 034.00</w:t>
-            </w:r>
-          </w:p>
-        </w:tc>
-      </w:tr>
-      <w:tr>
-        <w:trPr>
-          <w:trHeight w:val="287"/>
-        </w:trPr>
-        <w:tc>
-          <w:tcPr>
-            <w:tcW w:w="1776" w:type="pct"/>
-            <w:tcBorders>
-              <w:top w:val="nil"/>
-              <w:left w:val="nil"/>
-              <w:right w:val="nil"/>
-            </w:tcBorders>
-            <w:shd w:val="clear" w:color="000000" w:fill="D9D9D9"/>
-            <w:vAlign w:val="center"/>
-            <w:hideMark/>
-          </w:tcPr>
-          <w:p>
-            <w:pPr>
-              <w:spacing w:after="0" w:line="240" w:lineRule="auto"/>
-              <w:jc w:val="center"/>
-              <w:rPr>
-                <w:rFonts w:ascii="Calibri" w:eastAsia="Times New Roman" w:hAnsi="Calibri" w:cs="Calibri"/>
-                <w:color w:val="000000"/>
-                <w:lang w:val="es-419"/>
-              </w:rPr>
-            </w:pPr>
-            <w:r>
-              <w:rPr>
-                <w:rFonts w:ascii="Calibri" w:eastAsia="Times New Roman" w:hAnsi="Calibri" w:cs="Calibri"/>
-                <w:color w:val="000000"/>
-                <w:lang w:val="es-419"/>
-              </w:rPr>
-              <w:t>0.7</w:t>
-            </w:r>
-          </w:p>
-        </w:tc>
-        <w:tc>
-          <w:tcPr>
-            <w:tcW w:w="1674" w:type="pct"/>
-            <w:tcBorders>
-              <w:top w:val="nil"/>
-              <w:left w:val="nil"/>
-              <w:right w:val="nil"/>
-            </w:tcBorders>
-            <w:shd w:val="clear" w:color="D9D9D9" w:fill="D9D9D9"/>
-            <w:vAlign w:val="center"/>
-          </w:tcPr>
-          <w:p>
-            <w:pPr>
-              <w:spacing w:after="0" w:line="240" w:lineRule="auto"/>
-              <w:jc w:val="center"/>
-              <w:rPr>
-                <w:rFonts w:ascii="Calibri" w:eastAsia="Times New Roman" w:hAnsi="Calibri" w:cs="Calibri"/>
-                <w:color w:val="000000"/>
-                <w:lang w:val="es-419"/>
-              </w:rPr>
-            </w:pPr>
-            <w:r>
-              <w:rPr>
-                <w:rFonts w:ascii="Calibri" w:eastAsia="Times New Roman" w:hAnsi="Calibri" w:cs="Calibri"/>
-                <w:color w:val="000000"/>
-                <w:lang w:val="es-419"/>
-              </w:rPr>
-              <w:t>372 786.98</w:t>
-            </w:r>
-          </w:p>
-        </w:tc>
-        <w:tc>
-          <w:tcPr>
-            <w:tcW w:w="1550" w:type="pct"/>
-            <w:tcBorders>
-              <w:top w:val="nil"/>
-              <w:left w:val="nil"/>
-              <w:right w:val="nil"/>
-            </w:tcBorders>
-            <w:shd w:val="clear" w:color="D9D9D9" w:fill="D9D9D9"/>
-            <w:noWrap/>
-            <w:vAlign w:val="center"/>
-          </w:tcPr>
-          <w:p>
-            <w:pPr>
-              <w:spacing w:after="0" w:line="240" w:lineRule="auto"/>
-              <w:jc w:val="center"/>
-              <w:rPr>
-                <w:rFonts w:ascii="Calibri" w:eastAsia="Times New Roman" w:hAnsi="Calibri" w:cs="Calibri"/>
-                <w:color w:val="000000"/>
-                <w:lang w:val="es-419"/>
-              </w:rPr>
-            </w:pPr>
-            <w:r>
-              <w:rPr>
-                <w:rFonts w:ascii="Calibri" w:eastAsia="Times New Roman" w:hAnsi="Calibri" w:cs="Calibri"/>
-                <w:color w:val="000000"/>
-                <w:lang w:val="es-419"/>
-              </w:rPr>
-              <w:t>5 549.00</w:t>
-            </w:r>
-          </w:p>
-        </w:tc>
-      </w:tr>
-      <w:tr>
-        <w:trPr>
-          <w:trHeight w:val="294"/>
-        </w:trPr>
-        <w:tc>
-          <w:tcPr>
-            <w:tcW w:w="1776" w:type="pct"/>
-            <w:tcBorders>
-              <w:top w:val="nil"/>
-              <w:left w:val="nil"/>
-              <w:bottom w:val="single" w:sz="4" w:space="0" w:color="auto"/>
-              <w:right w:val="nil"/>
-            </w:tcBorders>
-            <w:vAlign w:val="center"/>
-            <w:hideMark/>
-          </w:tcPr>
-          <w:p>
-            <w:pPr>
-              <w:spacing w:after="0" w:line="240" w:lineRule="auto"/>
-              <w:jc w:val="center"/>
-              <w:rPr>
-                <w:rFonts w:ascii="Calibri" w:eastAsia="Times New Roman" w:hAnsi="Calibri" w:cs="Calibri"/>
-                <w:color w:val="000000"/>
-                <w:lang w:val="es-419"/>
-              </w:rPr>
-            </w:pPr>
-            <w:r>
-              <w:rPr>
-                <w:rFonts w:ascii="Calibri" w:eastAsia="Times New Roman" w:hAnsi="Calibri" w:cs="Calibri"/>
-                <w:color w:val="000000"/>
-                <w:lang w:val="es-419"/>
-              </w:rPr>
-              <w:t>0.9</w:t>
-            </w:r>
-          </w:p>
-        </w:tc>
-        <w:tc>
-          <w:tcPr>
-            <w:tcW w:w="1674" w:type="pct"/>
-            <w:tcBorders>
-              <w:top w:val="nil"/>
-              <w:left w:val="nil"/>
-              <w:bottom w:val="single" w:sz="4" w:space="0" w:color="auto"/>
-              <w:right w:val="nil"/>
-            </w:tcBorders>
-            <w:vAlign w:val="center"/>
-          </w:tcPr>
-          <w:p>
-            <w:pPr>
-              <w:spacing w:after="0" w:line="240" w:lineRule="auto"/>
-              <w:jc w:val="center"/>
-              <w:rPr>
-                <w:rFonts w:ascii="Calibri" w:eastAsia="Times New Roman" w:hAnsi="Calibri" w:cs="Calibri"/>
-                <w:color w:val="000000"/>
-                <w:lang w:val="es-419"/>
-              </w:rPr>
-            </w:pPr>
-            <w:r>
-              <w:rPr>
-                <w:rFonts w:ascii="Calibri" w:eastAsia="Times New Roman" w:hAnsi="Calibri" w:cs="Calibri"/>
-                <w:color w:val="000000"/>
-                <w:lang w:val="es-419"/>
-              </w:rPr>
-              <w:t>368 143.08</w:t>
-            </w:r>
-          </w:p>
-        </w:tc>
-        <w:tc>
-          <w:tcPr>
-            <w:tcW w:w="1550" w:type="pct"/>
-            <w:tcBorders>
-              <w:top w:val="nil"/>
-              <w:left w:val="nil"/>
-              <w:bottom w:val="single" w:sz="4" w:space="0" w:color="auto"/>
-              <w:right w:val="nil"/>
-            </w:tcBorders>
-            <w:noWrap/>
-            <w:vAlign w:val="center"/>
-          </w:tcPr>
-          <w:p>
-            <w:pPr>
-              <w:spacing w:after="0" w:line="240" w:lineRule="auto"/>
-              <w:jc w:val="center"/>
-              <w:rPr>
-                <w:rFonts w:ascii="Calibri" w:eastAsia="Times New Roman" w:hAnsi="Calibri" w:cs="Calibri"/>
-                <w:color w:val="000000"/>
-                <w:lang w:val="es-419"/>
-              </w:rPr>
-            </w:pPr>
-            <w:r>
-              <w:rPr>
-                <w:rFonts w:ascii="Calibri" w:eastAsia="Times New Roman" w:hAnsi="Calibri" w:cs="Calibri"/>
-                <w:color w:val="000000"/>
-                <w:lang w:val="es-419"/>
-              </w:rPr>
-              <w:t>5 695.00</w:t>
-            </w:r>
-          </w:p>
-        </w:tc>
-      </w:tr>
-    </w:tbl>
-    <w:p>
-      <w:pPr>
-        <w:pStyle w:val="Descripcin"/>
-        <w:jc w:val="center"/>
-        <w:rPr>
-          <w:lang w:val="es-CO"/>
-        </w:rPr>
-      </w:pPr>
-      <w:bookmarkStart w:id="1" w:name="_Ref66842973"/>
-      <w:r>
-        <w:rPr>
-          <w:lang w:val="es-CO"/>
-        </w:rPr>
-        <w:t xml:space="preserve">Tabla 4. Comparación de consumo de datos y tiempo de ejecución para carga de catálogo con el índice por categorías utilizando LINEAR PROBING en la Máquina 2</w:t>
-      </w:r>
-      <w:r>
-        <w:rPr>
-          <w:lang w:val="es-CO"/>
-        </w:rPr>
-        <w:fldChar w:fldCharType="begin"/>
-      </w:r>
-      <w:r>
-        <w:rPr>
-          <w:lang w:val="es-CO"/>
-        </w:rPr>
-        <w:instrText xml:space="preserve"> SEQ Tabla \* ARABIC </w:instrText>
-      </w:r>
-      <w:r>
-        <w:rPr>
-          <w:lang w:val="es-CO"/>
-        </w:rPr>
-        <w:fldChar w:fldCharType="separate"/>
-      </w:r>
-      <w:r>
-        <w:rPr>
-          <w:noProof/>
-          <w:lang w:val="es-CO"/>
-        </w:rPr>
-        <w:t/>
-      </w:r>
-      <w:r>
-        <w:rPr>
-          <w:lang w:val="es-CO"/>
-        </w:rPr>
-        <w:fldChar w:fldCharType="end"/>
-      </w:r>
-      <w:bookmarkEnd w:id="1"/>
-      <w:r>
-        <w:rPr>
-          <w:lang w:val="es-CO"/>
-        </w:rPr>
-        <w:t xml:space="preserve"/>
-      </w:r>
-      <w:r>
-        <w:rPr>
-          <w:lang w:val="es-CO"/>
-        </w:rPr>
-        <w:t/>
-      </w:r>
-      <w:r>
-        <w:rPr>
-          <w:lang w:val="es-CO"/>
-        </w:rPr>
-        <w:t xml:space="preserve"/>
-      </w:r>
-      <w:r>
-        <w:rPr>
-          <w:smallCaps/>
-          <w:lang w:val="es-CO"/>
-        </w:rPr>
-        <w:t xml:space="preserve"/>
-      </w:r>
-      <w:r>
-        <w:rPr>
-          <w:lang w:val="es-CO"/>
-        </w:rPr>
-        <w:t xml:space="preserve"/>
-      </w:r>
-    </w:p>
-    <w:tbl>
-      <w:tblPr>
-        <w:tblW w:w="5000" w:type="pct"/>
-        <w:tblLook w:val="04A0" w:firstRow="1" w:lastRow="0" w:firstColumn="1" w:lastColumn="0" w:noHBand="0" w:noVBand="1"/>
-      </w:tblPr>
-      <w:tblGrid>
-        <w:gridCol w:w="3324"/>
-        <w:gridCol w:w="3134"/>
-        <w:gridCol w:w="2902"/>
-      </w:tblGrid>
-      <w:tr>
-        <w:trPr>
-          <w:trHeight w:val="360"/>
-        </w:trPr>
-        <w:tc>
-          <w:tcPr>
-            <w:tcW w:w="5000" w:type="pct"/>
-            <w:gridSpan w:val="3"/>
-            <w:tcBorders>
-              <w:top w:val="nil"/>
-              <w:left w:val="nil"/>
-              <w:bottom w:val="nil"/>
-              <w:right w:val="nil"/>
-            </w:tcBorders>
-            <w:noWrap/>
-            <w:vAlign w:val="center"/>
-            <w:hideMark/>
-          </w:tcPr>
-          <w:p>
-            <w:pPr>
-              <w:spacing w:after="0" w:line="240" w:lineRule="auto"/>
-              <w:jc w:val="center"/>
-              <w:rPr>
-                <w:rFonts w:ascii="Calibri" w:eastAsia="Times New Roman" w:hAnsi="Calibri" w:cs="Calibri"/>
-                <w:b/>
-                <w:bCs/>
-                <w:i/>
-                <w:iCs/>
-                <w:color w:val="000000"/>
-                <w:sz w:val="28"/>
-                <w:szCs w:val="28"/>
-                <w:u w:val="single"/>
-                <w:lang w:val="es-419"/>
-              </w:rPr>
-            </w:pPr>
-            <w:r>
-              <w:rPr>
-                <w:rFonts w:ascii="Calibri" w:eastAsia="Times New Roman" w:hAnsi="Calibri" w:cs="Calibri"/>
-                <w:b/>
-                <w:bCs/>
-                <w:i/>
-                <w:iCs/>
-                <w:color w:val="000000"/>
-                <w:sz w:val="28"/>
-                <w:szCs w:val="28"/>
-                <w:u w:val="single"/>
-                <w:lang w:val="es-419"/>
-              </w:rPr>
-              <w:t>Carga de Catálogo SEPARATE CHAINING – MÁQUINA 2</w:t>
-            </w:r>
-          </w:p>
-        </w:tc>
-      </w:tr>
-      <w:tr>
-        <w:trPr>
-          <w:trHeight w:val="574"/>
-        </w:trPr>
-        <w:tc>
-          <w:tcPr>
-            <w:tcW w:w="1776" w:type="pct"/>
-            <w:tcBorders>
-              <w:top w:val="single" w:sz="4" w:space="0" w:color="000000"/>
-              <w:left w:val="nil"/>
-              <w:bottom w:val="single" w:sz="4" w:space="0" w:color="000000"/>
-              <w:right w:val="nil"/>
-            </w:tcBorders>
-            <w:vAlign w:val="center"/>
-            <w:hideMark/>
-          </w:tcPr>
-          <w:p>
-            <w:pPr>
-              <w:spacing w:after="0" w:line="240" w:lineRule="auto"/>
-              <w:jc w:val="center"/>
-              <w:rPr>
-                <w:rFonts w:ascii="Calibri" w:eastAsia="Times New Roman" w:hAnsi="Calibri" w:cs="Calibri"/>
-                <w:b/>
-                <w:bCs/>
-                <w:color w:val="000000"/>
-                <w:lang w:val="es-419"/>
-              </w:rPr>
-            </w:pPr>
-            <w:r>
-              <w:rPr>
-                <w:rFonts w:ascii="Calibri" w:eastAsia="Times New Roman" w:hAnsi="Calibri" w:cs="Calibri"/>
-                <w:b/>
-                <w:bCs/>
-                <w:color w:val="000000"/>
-                <w:lang w:val="es-419"/>
-              </w:rPr>
-              <w:t>Factor de Carga (CHAINING)</w:t>
-            </w:r>
-          </w:p>
-        </w:tc>
-        <w:tc>
-          <w:tcPr>
-            <w:tcW w:w="1674" w:type="pct"/>
-            <w:tcBorders>
-              <w:top w:val="single" w:sz="4" w:space="0" w:color="000000"/>
-              <w:left w:val="nil"/>
-              <w:bottom w:val="single" w:sz="4" w:space="0" w:color="000000"/>
-              <w:right w:val="nil"/>
-            </w:tcBorders>
-            <w:vAlign w:val="center"/>
-            <w:hideMark/>
-          </w:tcPr>
-          <w:p>
-            <w:pPr>
-              <w:spacing w:after="0" w:line="240" w:lineRule="auto"/>
-              <w:jc w:val="center"/>
-              <w:rPr>
-                <w:rFonts w:ascii="Calibri" w:eastAsia="Times New Roman" w:hAnsi="Calibri" w:cs="Calibri"/>
-                <w:b/>
-                <w:bCs/>
-                <w:color w:val="000000"/>
-                <w:lang w:val="es-419"/>
-              </w:rPr>
-            </w:pPr>
-            <w:r>
-              <w:rPr>
-                <w:rFonts w:ascii="Calibri" w:eastAsia="Times New Roman" w:hAnsi="Calibri" w:cs="Calibri"/>
-                <w:b/>
-                <w:bCs/>
-                <w:color w:val="000000"/>
-                <w:lang w:val="es-419"/>
-              </w:rPr>
-              <w:t>Consumo de Datos [kB]</w:t>
-            </w:r>
-          </w:p>
-        </w:tc>
-        <w:tc>
-          <w:tcPr>
-            <w:tcW w:w="1550" w:type="pct"/>
-            <w:tcBorders>
-              <w:top w:val="single" w:sz="4" w:space="0" w:color="000000"/>
-              <w:left w:val="nil"/>
-              <w:bottom w:val="single" w:sz="4" w:space="0" w:color="000000"/>
-              <w:right w:val="nil"/>
-            </w:tcBorders>
-            <w:vAlign w:val="center"/>
-            <w:hideMark/>
-          </w:tcPr>
-          <w:p>
-            <w:pPr>
-              <w:spacing w:after="0" w:line="240" w:lineRule="auto"/>
-              <w:jc w:val="center"/>
-              <w:rPr>
-                <w:rFonts w:ascii="Calibri" w:eastAsia="Times New Roman" w:hAnsi="Calibri" w:cs="Calibri"/>
-                <w:b/>
-                <w:bCs/>
-                <w:color w:val="000000"/>
-                <w:lang w:val="es-419"/>
-              </w:rPr>
-            </w:pPr>
-            <w:r>
-              <w:rPr>
-                <w:rFonts w:ascii="Calibri" w:eastAsia="Times New Roman" w:hAnsi="Calibri" w:cs="Calibri"/>
-                <w:b/>
-                <w:bCs/>
-                <w:color w:val="000000"/>
-                <w:lang w:val="es-419"/>
-              </w:rPr>
-              <w:t>Tiempo de Ejecución Real @SC [ms]</w:t>
-            </w:r>
-          </w:p>
-        </w:tc>
-      </w:tr>
-      <w:tr>
-        <w:trPr>
-          <w:trHeight w:val="287"/>
-        </w:trPr>
-        <w:tc>
-          <w:tcPr>
-            <w:tcW w:w="1776" w:type="pct"/>
-            <w:tcBorders>
-              <w:top w:val="nil"/>
-              <w:left w:val="nil"/>
-              <w:bottom w:val="nil"/>
-              <w:right w:val="nil"/>
-            </w:tcBorders>
-            <w:shd w:val="clear" w:color="D9D9D9" w:fill="D9D9D9"/>
-            <w:vAlign w:val="center"/>
-            <w:hideMark/>
-          </w:tcPr>
-          <w:p>
-            <w:pPr>
-              <w:spacing w:after="0" w:line="240" w:lineRule="auto"/>
-              <w:jc w:val="center"/>
-              <w:rPr>
-                <w:rFonts w:ascii="Calibri" w:eastAsia="Times New Roman" w:hAnsi="Calibri" w:cs="Calibri"/>
-                <w:color w:val="000000"/>
-                <w:lang w:val="es-419"/>
-              </w:rPr>
-            </w:pPr>
-            <w:r>
-              <w:rPr>
-                <w:rFonts w:ascii="Calibri" w:eastAsia="Times New Roman" w:hAnsi="Calibri" w:cs="Calibri"/>
-                <w:color w:val="000000"/>
-                <w:lang w:val="es-419"/>
-              </w:rPr>
-              <w:t>2.00</w:t>
-            </w:r>
-          </w:p>
-        </w:tc>
-        <w:tc>
-          <w:tcPr>
-            <w:tcW w:w="1674" w:type="pct"/>
-            <w:tcBorders>
-              <w:top w:val="nil"/>
-              <w:left w:val="nil"/>
-              <w:bottom w:val="nil"/>
-              <w:right w:val="nil"/>
-            </w:tcBorders>
-            <w:shd w:val="clear" w:color="D9D9D9" w:fill="D9D9D9"/>
-            <w:vAlign w:val="center"/>
-          </w:tcPr>
-          <w:p>
-            <w:pPr>
-              <w:spacing w:after="0" w:line="240" w:lineRule="auto"/>
-              <w:jc w:val="center"/>
-              <w:rPr>
-                <w:rFonts w:ascii="Calibri" w:eastAsia="Times New Roman" w:hAnsi="Calibri" w:cs="Calibri"/>
-                <w:color w:val="000000"/>
-                <w:lang w:val="es-419"/>
-              </w:rPr>
-            </w:pPr>
-            <w:r>
-              <w:rPr>
-                <w:rFonts w:ascii="Calibri" w:eastAsia="Times New Roman" w:hAnsi="Calibri" w:cs="Calibri"/>
-                <w:color w:val="000000"/>
-                <w:lang w:val="es-419"/>
-              </w:rPr>
-              <w:t>397 910.36</w:t>
-            </w:r>
-          </w:p>
-        </w:tc>
-        <w:tc>
-          <w:tcPr>
-            <w:tcW w:w="1550" w:type="pct"/>
-            <w:tcBorders>
-              <w:top w:val="nil"/>
-              <w:left w:val="nil"/>
-              <w:bottom w:val="nil"/>
-              <w:right w:val="nil"/>
-            </w:tcBorders>
-            <w:shd w:val="clear" w:color="D9D9D9" w:fill="D9D9D9"/>
-            <w:vAlign w:val="center"/>
-          </w:tcPr>
-          <w:p>
-            <w:pPr>
-              <w:spacing w:after="0" w:line="240" w:lineRule="auto"/>
-              <w:jc w:val="center"/>
-              <w:rPr>
-                <w:rFonts w:ascii="Calibri" w:eastAsia="Times New Roman" w:hAnsi="Calibri" w:cs="Calibri"/>
-                <w:color w:val="000000"/>
-                <w:lang w:val="es-419"/>
-              </w:rPr>
-            </w:pPr>
-            <w:r>
-              <w:rPr>
-                <w:rFonts w:ascii="Calibri" w:eastAsia="Times New Roman" w:hAnsi="Calibri" w:cs="Calibri"/>
-                <w:color w:val="000000"/>
-                <w:lang w:val="es-419"/>
-              </w:rPr>
-              <w:t>4 995.00</w:t>
-            </w:r>
-          </w:p>
-        </w:tc>
-      </w:tr>
-      <w:tr>
-        <w:trPr>
-          <w:trHeight w:val="287"/>
-        </w:trPr>
-        <w:tc>
-          <w:tcPr>
-            <w:tcW w:w="1776" w:type="pct"/>
-            <w:tcBorders>
-              <w:top w:val="nil"/>
-              <w:left w:val="nil"/>
-              <w:bottom w:val="nil"/>
-              <w:right w:val="nil"/>
-            </w:tcBorders>
-            <w:vAlign w:val="center"/>
-            <w:hideMark/>
-          </w:tcPr>
-          <w:p>
-            <w:pPr>
-              <w:spacing w:after="0" w:line="240" w:lineRule="auto"/>
-              <w:jc w:val="center"/>
-              <w:rPr>
-                <w:rFonts w:ascii="Calibri" w:eastAsia="Times New Roman" w:hAnsi="Calibri" w:cs="Calibri"/>
-                <w:color w:val="000000"/>
-                <w:lang w:val="es-419"/>
-              </w:rPr>
-            </w:pPr>
-            <w:r>
-              <w:rPr>
-                <w:rFonts w:ascii="Calibri" w:eastAsia="Times New Roman" w:hAnsi="Calibri" w:cs="Calibri"/>
-                <w:color w:val="000000"/>
-                <w:lang w:val="es-419"/>
-              </w:rPr>
-              <w:t>4.00</w:t>
-            </w:r>
-          </w:p>
-        </w:tc>
-        <w:tc>
-          <w:tcPr>
-            <w:tcW w:w="1674" w:type="pct"/>
-            <w:tcBorders>
-              <w:top w:val="nil"/>
-              <w:left w:val="nil"/>
-              <w:bottom w:val="nil"/>
-              <w:right w:val="nil"/>
-            </w:tcBorders>
-            <w:vAlign w:val="center"/>
-          </w:tcPr>
-          <w:p>
-            <w:pPr>
-              <w:spacing w:after="0" w:line="240" w:lineRule="auto"/>
-              <w:jc w:val="center"/>
-              <w:rPr>
-                <w:rFonts w:ascii="Calibri" w:eastAsia="Times New Roman" w:hAnsi="Calibri" w:cs="Calibri"/>
-                <w:color w:val="000000"/>
-                <w:lang w:val="es-419"/>
-              </w:rPr>
-            </w:pPr>
-            <w:r>
-              <w:rPr>
-                <w:rFonts w:ascii="Calibri" w:eastAsia="Times New Roman" w:hAnsi="Calibri" w:cs="Calibri"/>
-                <w:color w:val="000000"/>
-                <w:lang w:val="es-419"/>
-              </w:rPr>
-              <w:t>393 473.95</w:t>
-            </w:r>
-          </w:p>
-        </w:tc>
-        <w:tc>
-          <w:tcPr>
-            <w:tcW w:w="1550" w:type="pct"/>
-            <w:tcBorders>
-              <w:top w:val="nil"/>
-              <w:left w:val="nil"/>
-              <w:bottom w:val="nil"/>
-              <w:right w:val="nil"/>
-            </w:tcBorders>
-            <w:vAlign w:val="center"/>
-          </w:tcPr>
-          <w:p>
-            <w:pPr>
-              <w:spacing w:after="0" w:line="240" w:lineRule="auto"/>
-              <w:jc w:val="center"/>
-              <w:rPr>
-                <w:rFonts w:ascii="Calibri" w:eastAsia="Times New Roman" w:hAnsi="Calibri" w:cs="Calibri"/>
-                <w:color w:val="000000"/>
-                <w:lang w:val="es-419"/>
-              </w:rPr>
-            </w:pPr>
-            <w:r>
-              <w:rPr>
-                <w:rFonts w:ascii="Calibri" w:eastAsia="Times New Roman" w:hAnsi="Calibri" w:cs="Calibri"/>
-                <w:color w:val="000000"/>
-                <w:lang w:val="es-419"/>
-              </w:rPr>
-              <w:t>5 372.00</w:t>
-            </w:r>
-          </w:p>
-        </w:tc>
-      </w:tr>
-      <w:tr>
-        <w:trPr>
-          <w:trHeight w:val="287"/>
-        </w:trPr>
-        <w:tc>
-          <w:tcPr>
-            <w:tcW w:w="1776" w:type="pct"/>
-            <w:tcBorders>
-              <w:top w:val="nil"/>
-              <w:left w:val="nil"/>
-              <w:bottom w:val="nil"/>
-              <w:right w:val="nil"/>
-            </w:tcBorders>
-            <w:shd w:val="clear" w:color="D9D9D9" w:fill="D9D9D9"/>
-            <w:vAlign w:val="center"/>
-            <w:hideMark/>
-          </w:tcPr>
-          <w:p>
-            <w:pPr>
-              <w:spacing w:after="0" w:line="240" w:lineRule="auto"/>
-              <w:jc w:val="center"/>
-              <w:rPr>
-                <w:rFonts w:ascii="Calibri" w:eastAsia="Times New Roman" w:hAnsi="Calibri" w:cs="Calibri"/>
-                <w:color w:val="000000"/>
-                <w:lang w:val="es-419"/>
-              </w:rPr>
-            </w:pPr>
-            <w:r>
-              <w:rPr>
-                <w:rFonts w:ascii="Calibri" w:eastAsia="Times New Roman" w:hAnsi="Calibri" w:cs="Calibri"/>
-                <w:color w:val="000000"/>
-                <w:lang w:val="es-419"/>
-              </w:rPr>
-              <w:t>6.00</w:t>
-            </w:r>
-          </w:p>
-        </w:tc>
-        <w:tc>
-          <w:tcPr>
-            <w:tcW w:w="1674" w:type="pct"/>
-            <w:tcBorders>
-              <w:top w:val="nil"/>
-              <w:left w:val="nil"/>
-              <w:bottom w:val="nil"/>
-              <w:right w:val="nil"/>
-            </w:tcBorders>
-            <w:shd w:val="clear" w:color="D9D9D9" w:fill="D9D9D9"/>
-            <w:vAlign w:val="center"/>
-          </w:tcPr>
-          <w:p>
-            <w:pPr>
-              <w:spacing w:after="0" w:line="240" w:lineRule="auto"/>
-              <w:jc w:val="center"/>
-              <w:rPr>
-                <w:rFonts w:ascii="Calibri" w:eastAsia="Times New Roman" w:hAnsi="Calibri" w:cs="Calibri"/>
-                <w:color w:val="000000"/>
-                <w:lang w:val="es-419"/>
-              </w:rPr>
-            </w:pPr>
-            <w:r>
-              <w:rPr>
-                <w:rFonts w:ascii="Calibri" w:eastAsia="Times New Roman" w:hAnsi="Calibri" w:cs="Calibri"/>
-                <w:color w:val="000000"/>
-                <w:lang w:val="es-419"/>
-              </w:rPr>
-              <w:t>392 405.91</w:t>
-            </w:r>
-          </w:p>
-        </w:tc>
-        <w:tc>
-          <w:tcPr>
-            <w:tcW w:w="1550" w:type="pct"/>
-            <w:tcBorders>
-              <w:top w:val="nil"/>
-              <w:left w:val="nil"/>
-              <w:bottom w:val="nil"/>
-              <w:right w:val="nil"/>
-            </w:tcBorders>
-            <w:shd w:val="clear" w:color="D9D9D9" w:fill="D9D9D9"/>
-            <w:vAlign w:val="center"/>
-          </w:tcPr>
-          <w:p>
-            <w:pPr>
-              <w:spacing w:after="0" w:line="240" w:lineRule="auto"/>
-              <w:jc w:val="center"/>
-              <w:rPr>
-                <w:rFonts w:ascii="Times New Roman" w:eastAsia="Times New Roman" w:hAnsi="Times New Roman" w:cs="Times New Roman"/>
-                <w:sz w:val="20"/>
-                <w:szCs w:val="20"/>
-                <w:lang w:val="es-419"/>
-              </w:rPr>
-            </w:pPr>
-            <w:r>
-              <w:rPr>
-                <w:rFonts w:ascii="Times New Roman" w:eastAsia="Times New Roman" w:hAnsi="Times New Roman" w:cs="Times New Roman"/>
-                <w:sz w:val="20"/>
-                <w:szCs w:val="20"/>
-                <w:lang w:val="es-419"/>
-              </w:rPr>
-              <w:t>5 406.00</w:t>
-            </w:r>
-          </w:p>
-        </w:tc>
-      </w:tr>
-      <w:tr>
-        <w:trPr>
-          <w:trHeight w:val="50"/>
-        </w:trPr>
-        <w:tc>
-          <w:tcPr>
-            <w:tcW w:w="1776" w:type="pct"/>
-            <w:tcBorders>
-              <w:top w:val="nil"/>
-              <w:left w:val="nil"/>
-              <w:bottom w:val="single" w:sz="4" w:space="0" w:color="000000"/>
-              <w:right w:val="nil"/>
-            </w:tcBorders>
-            <w:vAlign w:val="center"/>
-            <w:hideMark/>
-          </w:tcPr>
-          <w:p>
-            <w:pPr>
-              <w:spacing w:after="0" w:line="240" w:lineRule="auto"/>
-              <w:jc w:val="center"/>
-              <w:rPr>
-                <w:rFonts w:ascii="Calibri" w:eastAsia="Times New Roman" w:hAnsi="Calibri" w:cs="Calibri"/>
-                <w:color w:val="000000"/>
-                <w:lang w:val="es-419"/>
-              </w:rPr>
-            </w:pPr>
-            <w:r>
-              <w:rPr>
-                <w:rFonts w:ascii="Calibri" w:eastAsia="Times New Roman" w:hAnsi="Calibri" w:cs="Calibri"/>
-                <w:color w:val="000000"/>
-                <w:lang w:val="es-419"/>
-              </w:rPr>
-              <w:t>8.00</w:t>
-            </w:r>
-          </w:p>
-        </w:tc>
-        <w:tc>
-          <w:tcPr>
-            <w:tcW w:w="1674" w:type="pct"/>
-            <w:tcBorders>
-              <w:top w:val="nil"/>
-              <w:left w:val="nil"/>
-              <w:bottom w:val="single" w:sz="4" w:space="0" w:color="000000"/>
-              <w:right w:val="nil"/>
-            </w:tcBorders>
-            <w:vAlign w:val="center"/>
-          </w:tcPr>
-          <w:p>
-            <w:pPr>
-              <w:spacing w:after="0" w:line="240" w:lineRule="auto"/>
-              <w:jc w:val="center"/>
-              <w:rPr>
-                <w:rFonts w:ascii="Calibri" w:eastAsia="Times New Roman" w:hAnsi="Calibri" w:cs="Calibri"/>
-                <w:color w:val="000000"/>
-                <w:lang w:val="es-419"/>
-              </w:rPr>
-            </w:pPr>
-            <w:r>
-              <w:rPr>
-                <w:rFonts w:ascii="Calibri" w:eastAsia="Times New Roman" w:hAnsi="Calibri" w:cs="Calibri"/>
-                <w:color w:val="000000"/>
-                <w:lang w:val="es-419"/>
-              </w:rPr>
-              <w:t>392 381.33</w:t>
-            </w:r>
-          </w:p>
-        </w:tc>
-        <w:tc>
-          <w:tcPr>
-            <w:tcW w:w="1550" w:type="pct"/>
-            <w:tcBorders>
-              <w:top w:val="nil"/>
-              <w:left w:val="nil"/>
-              <w:bottom w:val="single" w:sz="4" w:space="0" w:color="000000"/>
-              <w:right w:val="nil"/>
-            </w:tcBorders>
-            <w:vAlign w:val="center"/>
-          </w:tcPr>
-          <w:p>
-            <w:pPr>
-              <w:spacing w:after="0" w:line="240" w:lineRule="auto"/>
-              <w:jc w:val="center"/>
-              <w:rPr>
-                <w:rFonts w:ascii="Calibri" w:eastAsia="Times New Roman" w:hAnsi="Calibri" w:cs="Calibri"/>
-                <w:color w:val="000000"/>
-                <w:lang w:val="es-419"/>
-              </w:rPr>
-            </w:pPr>
-            <w:r>
-              <w:rPr>
-                <w:rFonts w:ascii="Calibri" w:eastAsia="Times New Roman" w:hAnsi="Calibri" w:cs="Calibri"/>
-                <w:color w:val="000000"/>
-                <w:lang w:val="es-419"/>
-              </w:rPr>
-              <w:t>5 122.00</w:t>
-            </w:r>
-          </w:p>
-        </w:tc>
-      </w:tr>
-    </w:tbl>
-    <w:p>
-      <w:pPr>
-        <w:pStyle w:val="Descripcin"/>
-        <w:jc w:val="center"/>
-        <w:rPr>
-          <w:lang w:val="es-CO"/>
-        </w:rPr>
-      </w:pPr>
-      <w:bookmarkStart w:id="2" w:name="_Ref66842982"/>
-      <w:r>
-        <w:rPr>
-          <w:lang w:val="es-CO"/>
-        </w:rPr>
-        <w:t xml:space="preserve">Tabla 5. Comparación de consumo de datos y tiempo de ejecución para carga de catálogo con el índice por categorías utilizando SEPARATE CHAINING en la Máquina 2</w:t>
-      </w:r>
-      <w:r>
-        <w:rPr>
-          <w:lang w:val="es-CO"/>
-        </w:rPr>
-        <w:fldChar w:fldCharType="begin"/>
-      </w:r>
-      <w:r>
-        <w:rPr>
-          <w:lang w:val="es-CO"/>
-        </w:rPr>
-        <w:instrText xml:space="preserve"> SEQ Tabla \* ARABIC </w:instrText>
-      </w:r>
-      <w:r>
-        <w:rPr>
-          <w:lang w:val="es-CO"/>
-        </w:rPr>
-        <w:fldChar w:fldCharType="separate"/>
-      </w:r>
-      <w:r>
-        <w:rPr>
-          <w:noProof/>
-          <w:lang w:val="es-CO"/>
-        </w:rPr>
-        <w:t/>
-      </w:r>
-      <w:r>
-        <w:rPr>
-          <w:lang w:val="es-CO"/>
-        </w:rPr>
-        <w:fldChar w:fldCharType="end"/>
-      </w:r>
-      <w:bookmarkEnd w:id="2"/>
-      <w:r>
-        <w:rPr>
-          <w:lang w:val="es-CO"/>
-        </w:rPr>
-        <w:t xml:space="preserve"/>
-      </w:r>
-      <w:r>
-        <w:rPr>
-          <w:lang w:val="es-CO"/>
-        </w:rPr>
-        <w:t/>
-      </w:r>
-      <w:r>
-        <w:rPr>
-          <w:lang w:val="es-CO"/>
-        </w:rPr>
-        <w:t xml:space="preserve"/>
-      </w:r>
-      <w:r>
-        <w:rPr>
-          <w:lang w:val="es-CO"/>
-        </w:rPr>
-        <w:t xml:space="preserve"/>
-      </w:r>
-      <w:r>
-        <w:rPr>
-          <w:lang w:val="es-CO"/>
-        </w:rPr>
-        <w:t xml:space="preserve"/>
-      </w:r>
-    </w:p>
     <w:p>
       <w:pPr>
         <w:pStyle w:val="Ttulo2"/>
@@ -3457,130 +2047,6 @@
                     <a:prstGeom prst="rect">
                       <a:avLst/>
                     </a:prstGeom>
-                  </pic:spPr>
-                </pic:pic>
-              </a:graphicData>
-            </a:graphic>
-          </wp:inline>
-        </w:drawing>
-      </w:r>
-    </w:p>
-    <w:p>
-      <w:pPr>
-        <w:pStyle w:val="Prrafodelista"/>
-        <w:numPr>
-          <w:ilvl w:val="0"/>
-          <w:numId w:val="10"/>
-        </w:numPr>
-        <w:spacing w:after="0"/>
-        <w:jc w:val="both"/>
-        <w:rPr>
-          <w:rFonts w:ascii="Dax-Regular" w:hAnsi="Dax-Regular"/>
-          <w:lang w:val="es-CO"/>
-        </w:rPr>
-      </w:pPr>
-      <w:r>
-        <w:rPr>
-          <w:rFonts w:ascii="Dax-Regular" w:hAnsi="Dax-Regular"/>
-          <w:lang w:val="es-CO"/>
-        </w:rPr>
-        <w:t>Comparación de memoria y tiempo de ejecución para LINEAR PROBING y SEPARATE CHAINING (Máquina 2)</w:t>
-      </w:r>
-    </w:p>
-    <w:p>
-      <w:pPr>
-        <w:spacing w:before="120" w:after="240"/>
-        <w:jc w:val="center"/>
-      </w:pPr>
-      <w:r>
-        <w:drawing>
-          <wp:inline xmlns:a="http://schemas.openxmlformats.org/drawingml/2006/main" xmlns:pic="http://schemas.openxmlformats.org/drawingml/2006/picture">
-            <wp:extent cx="5349240" cy="3127248"/>
-            <wp:docPr id="903" name="Picture 903"/>
-            <wp:cNvGraphicFramePr>
-              <a:graphicFrameLocks noChangeAspect="1"/>
-            </wp:cNvGraphicFramePr>
-            <a:graphic>
-              <a:graphicData uri="http://schemas.openxmlformats.org/drawingml/2006/picture">
-                <pic:pic>
-                  <pic:nvPicPr>
-                    <pic:cNvPr id="0" name="grafica3.png"/>
-                    <pic:cNvPicPr/>
-                  </pic:nvPicPr>
-                  <pic:blipFill>
-                    <a:blip r:embed="rId14"/>
-                    <a:stretch>
-                      <a:fillRect/>
-                    </a:stretch>
-                  </pic:blipFill>
-                  <pic:spPr>
-                    <a:xfrm>
-                      <a:off x="0" y="0"/>
-                      <a:ext cx="5349240" cy="3127248"/>
-                    </a:xfrm>
-                    <a:prstGeom prst="rect"/>
-                  </pic:spPr>
-                </pic:pic>
-              </a:graphicData>
-            </a:graphic>
-          </wp:inline>
-        </w:drawing>
-      </w:r>
-    </w:p>
-    <w:p>
-      <w:pPr>
-        <w:pStyle w:val="Prrafodelista"/>
-        <w:numPr>
-          <w:ilvl w:val="0"/>
-          <w:numId w:val="10"/>
-        </w:numPr>
-        <w:spacing w:after="0"/>
-        <w:jc w:val="both"/>
-        <w:rPr>
-          <w:rFonts w:ascii="Dax-Regular" w:hAnsi="Dax-Regular"/>
-          <w:lang w:val="es-CO"/>
-        </w:rPr>
-      </w:pPr>
-      <w:r>
-        <w:rPr>
-          <w:rFonts w:ascii="Dax-Regular" w:hAnsi="Dax-Regular"/>
-          <w:lang w:val="es-CO"/>
-        </w:rPr>
-        <w:t>Comparación de factor de carga y tiempo de ejecución para LINEAR PROBING y SEPARATE CHAINING (Máquina 2)</w:t>
-      </w:r>
-    </w:p>
-    <w:p>
-      <w:pPr>
-        <w:spacing w:before="120" w:after="240"/>
-        <w:jc w:val="center"/>
-      </w:pPr>
-      <w:r>
-        <w:drawing>
-          <wp:inline xmlns:a="http://schemas.openxmlformats.org/drawingml/2006/main" xmlns:pic="http://schemas.openxmlformats.org/drawingml/2006/picture">
-            <wp:extent cx="5349240" cy="3127248"/>
-            <wp:docPr id="904" name="Picture 904"/>
-            <wp:cNvGraphicFramePr>
-              <a:graphicFrameLocks noChangeAspect="1"/>
-            </wp:cNvGraphicFramePr>
-            <a:graphic>
-              <a:graphicData uri="http://schemas.openxmlformats.org/drawingml/2006/picture">
-                <pic:pic>
-                  <pic:nvPicPr>
-                    <pic:cNvPr id="0" name="grafica4.png"/>
-                    <pic:cNvPicPr/>
-                  </pic:nvPicPr>
-                  <pic:blipFill>
-                    <a:blip r:embed="rId15"/>
-                    <a:stretch>
-                      <a:fillRect/>
-                    </a:stretch>
-                  </pic:blipFill>
-                  <pic:spPr>
-                    <a:xfrm>
-                      <a:off x="0" y="0"/>
-                      <a:ext cx="5349240" cy="3127248"/>
-                    </a:xfrm>
-                    <a:prstGeom prst="rect"/>
                   </pic:spPr>
                 </pic:pic>
               </a:graphicData>

</xml_diff>